<commit_message>
Forbedr kontrakt-dokumentets udseende og navngivning
- Skift al udfyldt data i kontrakten fra lilla til sort tekst - matcher
  et almindeligt professionelt dokument.
- Flyt faktureringsteksten op til lige efter etableringsprisen, i stedet
  for at ligge inde i "Yderligere betingelser"-boksen.
- Kontraktens navn i SignWell er nu "Nextview360 x <kunde>" i stedet for
  "Kontrakt - <kunde>".
- Tilføj Efternavn til profilen, så sælgerens fulde navn (ikke kun
  fornavn) vises på kontrakten - både som "Nextview kontaktperson" og
  ved underskrift "For leverandør - Nextview 360 ApS".
</commit_message>
<xml_diff>
--- a/src/contract-templates/nextview360-contract.docx
+++ b/src/contract-templates/nextview360-contract.docx
@@ -200,7 +200,7 @@
             <w:r>
               <w:rPr>
                 <w:rFonts w:ascii="Consolas" w:cs="Consolas" w:eastAsia="Consolas" w:hAnsi="Consolas"/>
-                <w:color w:val="8A1FCC"/>
+                <w:color w:val="000000"/>
                 <w:sz w:val="21"/>
                 <w:szCs w:val="21"/>
               </w:rPr>
@@ -261,7 +261,7 @@
             <w:r>
               <w:rPr>
                 <w:rFonts w:ascii="Consolas" w:cs="Consolas" w:eastAsia="Consolas" w:hAnsi="Consolas"/>
-                <w:color w:val="8A1FCC"/>
+                <w:color w:val="000000"/>
                 <w:sz w:val="21"/>
                 <w:szCs w:val="21"/>
               </w:rPr>
@@ -322,7 +322,7 @@
             <w:r>
               <w:rPr>
                 <w:rFonts w:ascii="Consolas" w:cs="Consolas" w:eastAsia="Consolas" w:hAnsi="Consolas"/>
-                <w:color w:val="8A1FCC"/>
+                <w:color w:val="000000"/>
                 <w:sz w:val="21"/>
                 <w:szCs w:val="21"/>
               </w:rPr>
@@ -448,7 +448,7 @@
             <w:r>
               <w:rPr>
                 <w:rFonts w:ascii="Consolas" w:cs="Consolas" w:eastAsia="Consolas" w:hAnsi="Consolas"/>
-                <w:color w:val="8A1FCC"/>
+                <w:color w:val="000000"/>
                 <w:sz w:val="21"/>
                 <w:szCs w:val="21"/>
               </w:rPr>
@@ -509,7 +509,7 @@
             <w:r>
               <w:rPr>
                 <w:rFonts w:ascii="Consolas" w:cs="Consolas" w:eastAsia="Consolas" w:hAnsi="Consolas"/>
-                <w:color w:val="8A1FCC"/>
+                <w:color w:val="000000"/>
                 <w:sz w:val="21"/>
                 <w:szCs w:val="21"/>
               </w:rPr>
@@ -580,7 +580,7 @@
             <w:r>
               <w:rPr>
                 <w:rFonts w:ascii="Consolas" w:cs="Consolas" w:eastAsia="Consolas" w:hAnsi="Consolas"/>
-                <w:color w:val="8A1FCC"/>
+                <w:color w:val="000000"/>
                 <w:sz w:val="21"/>
                 <w:szCs w:val="21"/>
               </w:rPr>
@@ -641,7 +641,7 @@
             <w:r>
               <w:rPr>
                 <w:rFonts w:ascii="Consolas" w:cs="Consolas" w:eastAsia="Consolas" w:hAnsi="Consolas"/>
-                <w:color w:val="8A1FCC"/>
+                <w:color w:val="000000"/>
                 <w:sz w:val="21"/>
                 <w:szCs w:val="21"/>
               </w:rPr>
@@ -702,7 +702,7 @@
             <w:r>
               <w:rPr>
                 <w:rFonts w:ascii="Consolas" w:cs="Consolas" w:eastAsia="Consolas" w:hAnsi="Consolas"/>
-                <w:color w:val="8A1FCC"/>
+                <w:color w:val="000000"/>
                 <w:sz w:val="21"/>
                 <w:szCs w:val="21"/>
               </w:rPr>
@@ -773,7 +773,7 @@
             <w:r>
               <w:rPr>
                 <w:rFonts w:ascii="Consolas" w:cs="Consolas" w:eastAsia="Consolas" w:hAnsi="Consolas"/>
-                <w:color w:val="8A1FCC"/>
+                <w:color w:val="000000"/>
                 <w:sz w:val="21"/>
                 <w:szCs w:val="21"/>
               </w:rPr>
@@ -844,7 +844,7 @@
             <w:r>
               <w:rPr>
                 <w:rFonts w:ascii="Consolas" w:cs="Consolas" w:eastAsia="Consolas" w:hAnsi="Consolas"/>
-                <w:color w:val="8A1FCC"/>
+                <w:color w:val="000000"/>
                 <w:sz w:val="21"/>
                 <w:szCs w:val="21"/>
               </w:rPr>
@@ -1130,7 +1130,7 @@
             <w:r>
               <w:rPr>
                 <w:rFonts w:ascii="Consolas" w:cs="Consolas" w:eastAsia="Consolas" w:hAnsi="Consolas"/>
-                <w:color w:val="8A1FCC"/>
+                <w:color w:val="000000"/>
                 <w:sz w:val="21"/>
                 <w:szCs w:val="21"/>
               </w:rPr>
@@ -1201,7 +1201,7 @@
             <w:r>
               <w:rPr>
                 <w:rFonts w:ascii="Consolas" w:cs="Consolas" w:eastAsia="Consolas" w:hAnsi="Consolas"/>
-                <w:color w:val="8A1FCC"/>
+                <w:color w:val="000000"/>
                 <w:sz w:val="21"/>
                 <w:szCs w:val="21"/>
               </w:rPr>
@@ -1272,7 +1272,7 @@
             <w:r>
               <w:rPr>
                 <w:rFonts w:ascii="Consolas" w:cs="Consolas" w:eastAsia="Consolas" w:hAnsi="Consolas"/>
-                <w:color w:val="8A1FCC"/>
+                <w:color w:val="000000"/>
                 <w:sz w:val="21"/>
                 <w:szCs w:val="21"/>
               </w:rPr>
@@ -1495,7 +1495,7 @@
             <w:r>
               <w:rPr>
                 <w:rFonts w:ascii="Consolas" w:cs="Consolas" w:eastAsia="Consolas" w:hAnsi="Consolas"/>
-                <w:color w:val="8A1FCC"/>
+                <w:color w:val="000000"/>
                 <w:sz w:val="21"/>
                 <w:szCs w:val="21"/>
               </w:rPr>
@@ -1566,7 +1566,7 @@
             <w:r>
               <w:rPr>
                 <w:rFonts w:ascii="Consolas" w:cs="Consolas" w:eastAsia="Consolas" w:hAnsi="Consolas"/>
-                <w:color w:val="8A1FCC"/>
+                <w:color w:val="000000"/>
                 <w:sz w:val="21"/>
                 <w:szCs w:val="21"/>
               </w:rPr>
@@ -1789,7 +1789,7 @@
             <w:r>
               <w:rPr>
                 <w:rFonts w:ascii="Consolas" w:cs="Consolas" w:eastAsia="Consolas" w:hAnsi="Consolas"/>
-                <w:color w:val="8A1FCC"/>
+                <w:color w:val="000000"/>
                 <w:sz w:val="21"/>
                 <w:szCs w:val="21"/>
               </w:rPr>
@@ -1860,7 +1860,7 @@
             <w:r>
               <w:rPr>
                 <w:rFonts w:ascii="Consolas" w:cs="Consolas" w:eastAsia="Consolas" w:hAnsi="Consolas"/>
-                <w:color w:val="8A1FCC"/>
+                <w:color w:val="000000"/>
                 <w:sz w:val="21"/>
                 <w:szCs w:val="21"/>
               </w:rPr>
@@ -2064,7 +2064,7 @@
             <w:r>
               <w:rPr>
                 <w:rFonts w:ascii="Consolas" w:cs="Consolas" w:eastAsia="Consolas" w:hAnsi="Consolas"/>
-                <w:color w:val="8A1FCC"/>
+                <w:color w:val="000000"/>
                 <w:sz w:val="21"/>
                 <w:szCs w:val="21"/>
               </w:rPr>
@@ -2135,7 +2135,7 @@
             <w:r>
               <w:rPr>
                 <w:rFonts w:ascii="Consolas" w:cs="Consolas" w:eastAsia="Consolas" w:hAnsi="Consolas"/>
-                <w:color w:val="8A1FCC"/>
+                <w:color w:val="000000"/>
                 <w:sz w:val="21"/>
                 <w:szCs w:val="21"/>
               </w:rPr>
@@ -2254,7 +2254,7 @@
             <w:r>
               <w:rPr>
                 <w:rFonts w:ascii="Consolas" w:cs="Consolas" w:eastAsia="Consolas" w:hAnsi="Consolas"/>
-                <w:color w:val="8A1FCC"/>
+                <w:color w:val="000000"/>
                 <w:sz w:val="21"/>
                 <w:szCs w:val="21"/>
               </w:rPr>
@@ -2325,7 +2325,7 @@
             <w:r>
               <w:rPr>
                 <w:rFonts w:ascii="Consolas" w:cs="Consolas" w:eastAsia="Consolas" w:hAnsi="Consolas"/>
-                <w:color w:val="8A1FCC"/>
+                <w:color w:val="000000"/>
                 <w:sz w:val="21"/>
                 <w:szCs w:val="21"/>
               </w:rPr>
@@ -2355,6 +2355,18 @@
           <w:szCs w:val="21"/>
         </w:rPr>
         <w:t xml:space="preserve">Etableringsprisen betales ved underskrift af kontrakten, med mindre andet er angivet i Yderligere betingelser.</w:t>
+      </w:r>
+    </w:p>
+    <w:p>
+      <w:pPr>
+        <w:spacing w:after="200"/>
+      </w:pPr>
+      <w:r>
+        <w:rPr>
+          <w:sz w:val="21"/>
+          <w:szCs w:val="21"/>
+        </w:rPr>
+        <w:t xml:space="preserve">Fakturering: Kvartalsvist forud (netto 8 dage), med mindre andet er angivet nedenfor.</w:t>
       </w:r>
     </w:p>
     <w:p>
@@ -2412,7 +2424,7 @@
             <w:r>
               <w:rPr>
                 <w:rFonts w:ascii="Consolas" w:cs="Consolas" w:eastAsia="Consolas" w:hAnsi="Consolas"/>
-                <w:color w:val="8A1FCC"/>
+                <w:color w:val="000000"/>
                 <w:sz w:val="21"/>
                 <w:szCs w:val="21"/>
               </w:rPr>
@@ -2427,18 +2439,6 @@
                 <w:szCs w:val="17"/>
               </w:rPr>
               <w:t xml:space="preserve">  (fritekst, valgfri)</w:t>
-            </w:r>
-          </w:p>
-          <w:p>
-            <w:pPr>
-              <w:spacing w:after="200"/>
-            </w:pPr>
-            <w:r>
-              <w:rPr>
-                <w:sz w:val="21"/>
-                <w:szCs w:val="21"/>
-              </w:rPr>
-              <w:t xml:space="preserve">Fakturering: Kvartalsvist forud (netto 8 dage), med mindre andet er angivet nedenfor.</w:t>
             </w:r>
           </w:p>
           <w:p>
@@ -2572,7 +2572,7 @@
             <w:r>
               <w:rPr>
                 <w:rFonts w:ascii="Consolas" w:cs="Consolas" w:eastAsia="Consolas" w:hAnsi="Consolas"/>
-                <w:color w:val="8A1FCC"/>
+                <w:color w:val="000000"/>
                 <w:sz w:val="21"/>
                 <w:szCs w:val="21"/>
               </w:rPr>
@@ -2643,7 +2643,7 @@
             <w:r>
               <w:rPr>
                 <w:rFonts w:ascii="Consolas" w:cs="Consolas" w:eastAsia="Consolas" w:hAnsi="Consolas"/>
-                <w:color w:val="8A1FCC"/>
+                <w:color w:val="000000"/>
                 <w:sz w:val="21"/>
                 <w:szCs w:val="21"/>
               </w:rPr>
@@ -2879,7 +2879,7 @@
             <w:r>
               <w:rPr>
                 <w:rFonts w:ascii="Consolas" w:cs="Consolas" w:eastAsia="Consolas" w:hAnsi="Consolas"/>
-                <w:color w:val="8A1FCC"/>
+                <w:color w:val="000000"/>
                 <w:sz w:val="21"/>
                 <w:szCs w:val="21"/>
               </w:rPr>
@@ -2940,7 +2940,7 @@
             <w:r>
               <w:rPr>
                 <w:rFonts w:ascii="Consolas" w:cs="Consolas" w:eastAsia="Consolas" w:hAnsi="Consolas"/>
-                <w:color w:val="8A1FCC"/>
+                <w:color w:val="000000"/>
                 <w:sz w:val="21"/>
                 <w:szCs w:val="21"/>
               </w:rPr>
@@ -3001,7 +3001,7 @@
             <w:r>
               <w:rPr>
                 <w:rFonts w:ascii="Consolas" w:cs="Consolas" w:eastAsia="Consolas" w:hAnsi="Consolas"/>
-                <w:color w:val="8A1FCC"/>
+                <w:color w:val="000000"/>
                 <w:sz w:val="21"/>
                 <w:szCs w:val="21"/>
               </w:rPr>
@@ -3033,7 +3033,7 @@
       <w:r>
         <w:rPr>
           <w:rFonts w:ascii="Consolas" w:cs="Consolas" w:eastAsia="Consolas" w:hAnsi="Consolas"/>
-          <w:color w:val="8A1FCC"/>
+          <w:color w:val="000000"/>
           <w:sz w:val="21"/>
           <w:szCs w:val="21"/>
         </w:rPr>
@@ -3108,7 +3108,7 @@
             <w:r>
               <w:rPr>
                 <w:rFonts w:ascii="Consolas" w:cs="Consolas" w:eastAsia="Consolas" w:hAnsi="Consolas"/>
-                <w:color w:val="8A1FCC"/>
+                <w:color w:val="000000"/>
                 <w:sz w:val="21"/>
                 <w:szCs w:val="21"/>
               </w:rPr>
@@ -3169,7 +3169,7 @@
             <w:r>
               <w:rPr>
                 <w:rFonts w:ascii="Consolas" w:cs="Consolas" w:eastAsia="Consolas" w:hAnsi="Consolas"/>
-                <w:color w:val="8A1FCC"/>
+                <w:color w:val="000000"/>
                 <w:sz w:val="21"/>
                 <w:szCs w:val="21"/>
               </w:rPr>
@@ -3230,7 +3230,7 @@
             <w:r>
               <w:rPr>
                 <w:rFonts w:ascii="Consolas" w:cs="Consolas" w:eastAsia="Consolas" w:hAnsi="Consolas"/>
-                <w:color w:val="8A1FCC"/>
+                <w:color w:val="000000"/>
                 <w:sz w:val="21"/>
                 <w:szCs w:val="21"/>
               </w:rPr>

</xml_diff>

<commit_message>
Skift kontrakt-underskrift fra SignWell til DocuSeal
- Ny DocuSeal-klient (X-Auth-Token, EU-server) og opdateret
  send/annullér/download-flow, verificeret direkte mod den rigtige API.
- Kontrakt-skabelonen bruger nu DocuSeal's rolle-baserede felt-tags
  ({{Sign;type=signature;role=X}}/{{Date;type=datenow;role=X}}) i stedet
  for SignWells - dato udfyldes nu automatisk ved underskrift, og
  underskriftsfelterne er gjort større.
- Sender til begge parter samtidig (order=random) i stedet for DocuSeals
  standard, hvor kunden først får besked når vores side har underskrevet.
- Webhook-endpoint flyttet til /api/integrations/docuseal/webhook med
  HMAC-verificering af DocuSeals signaturheader.
- Webhook kan ikke oprettes via API hos DocuSeal (kun i deres Console) -
  indstillingssiden viser nu instruktioner i stedet for en knap.
- Nextview360-underskriveren er nu altid "Lasse Larsen" uafhængigt af
  hvilken sælger der ejer dealen.
</commit_message>
<xml_diff>
--- a/src/contract-templates/nextview360-contract.docx
+++ b/src/contract-templates/nextview360-contract.docx
@@ -2883,7 +2883,7 @@
                 <w:sz w:val="21"/>
                 <w:szCs w:val="21"/>
               </w:rPr>
-              <w:t xml:space="preserve">[[Seller.Name]]</w:t>
+              <w:t xml:space="preserve">Lasse Larsen</w:t>
             </w:r>
           </w:p>
         </w:tc>
@@ -2944,12 +2944,15 @@
                 <w:sz w:val="21"/>
                 <w:szCs w:val="21"/>
               </w:rPr>
-              <w:t xml:space="preserve">{{date:1}}</w:t>
+              <w:t xml:space="preserve">{{Date;type=datenow;role=Company}}</w:t>
             </w:r>
           </w:p>
         </w:tc>
       </w:tr>
       <w:tr>
+        <w:trPr>
+          <w:trHeight w:val="1100" w:hRule="atLeast"/>
+        </w:trPr>
         <w:tc>
           <w:tcPr>
             <w:tcW w:type="pct" w:w="28%"/>
@@ -3002,10 +3005,10 @@
               <w:rPr>
                 <w:rFonts w:ascii="Consolas" w:cs="Consolas" w:eastAsia="Consolas" w:hAnsi="Consolas"/>
                 <w:color w:val="000000"/>
-                <w:sz w:val="21"/>
-                <w:szCs w:val="21"/>
-              </w:rPr>
-              <w:t xml:space="preserve">{{signature:1}}</w:t>
+                <w:sz w:val="64"/>
+                <w:szCs w:val="64"/>
+              </w:rPr>
+              <w:t xml:space="preserve">{{Sign;type=signature;role=Company}}</w:t>
             </w:r>
           </w:p>
         </w:tc>
@@ -3173,12 +3176,15 @@
                 <w:sz w:val="21"/>
                 <w:szCs w:val="21"/>
               </w:rPr>
-              <w:t xml:space="preserve">{{date:2}}</w:t>
+              <w:t xml:space="preserve">{{Date;type=datenow;role=Customer}}</w:t>
             </w:r>
           </w:p>
         </w:tc>
       </w:tr>
       <w:tr>
+        <w:trPr>
+          <w:trHeight w:val="1100" w:hRule="atLeast"/>
+        </w:trPr>
         <w:tc>
           <w:tcPr>
             <w:tcW w:type="pct" w:w="28%"/>
@@ -3231,10 +3237,10 @@
               <w:rPr>
                 <w:rFonts w:ascii="Consolas" w:cs="Consolas" w:eastAsia="Consolas" w:hAnsi="Consolas"/>
                 <w:color w:val="000000"/>
-                <w:sz w:val="21"/>
-                <w:szCs w:val="21"/>
-              </w:rPr>
-              <w:t xml:space="preserve">{{signature:2}}</w:t>
+                <w:sz w:val="64"/>
+                <w:szCs w:val="64"/>
+              </w:rPr>
+              <w:t xml:space="preserve">{{Sign;type=signature;role=Customer}}</w:t>
             </w:r>
           </w:p>
         </w:tc>

</xml_diff>

<commit_message>
Ret NaN-fejl, tilføj kontrakt-status hover, fornavn på profil, og forbedr dashboardtal
- Ret NaN-fejl i kontraktbygger ved at filtrere NaN i onChange i stedet for kun i visningen
- Ret at klik ved siden af produkt-checkboxen slog den til/fra (label -> div/span)
- Tilføj lille hover-boks på dealsiden der viser sendt/åbnet/underskrevet-status for kontrakten
- Tilføj "Fornavn" felt på profilsiden så det matcher Efternavn og Telefon
- Dashboard: "Solgt denne måned" og "Solgt etableringspris denne måned" er nu etableringspris + månedspris (ikke fuld kontraktværdi over bindingsperioden), og har samme flotte hover-boks-design som kontraktstatus
- Dashboard: "Aktiv pipeline" tæller nu kun deals fra "møde booket" og opefter
- Dashboard: "Aktive kunder (Live)" omdøbt til "Solgt i alt (MRR + etableringspris)" og inkluderer nu etableringsprisen i værdien
</commit_message>
<xml_diff>
--- a/src/contract-templates/nextview360-contract.docx
+++ b/src/contract-templates/nextview360-contract.docx
@@ -1107,8 +1107,10 @@
         </w:tblBorders>
       </w:tblPr>
       <w:tblGrid>
-        <w:gridCol w:w="2600"/>
-        <w:gridCol w:w="6700"/>
+        <w:gridCol w:w="1300"/>
+        <w:gridCol w:w="3350"/>
+        <w:gridCol w:w="1300"/>
+        <w:gridCol w:w="3350"/>
       </w:tblGrid>
       <w:tr>
         <w:trPr>
@@ -1116,7 +1118,7 @@
         </w:trPr>
         <w:tc>
           <w:tcPr>
-            <w:tcW w:type="pct" w:w="28%"/>
+            <w:tcW w:type="pct" w:w="14%"/>
             <w:tcBorders>
               <w:top w:val="none" w:color="FFFFFF" w:sz="0"/>
               <w:left w:val="none" w:color="FFFFFF" w:sz="0"/>
@@ -1142,7 +1144,7 @@
         </w:tc>
         <w:tc>
           <w:tcPr>
-            <w:tcW w:type="pct" w:w="72%"/>
+            <w:tcW w:type="pct" w:w="36%"/>
             <w:tcBorders>
               <w:top w:val="none" w:color="FFFFFF" w:sz="0"/>
               <w:left w:val="none" w:color="FFFFFF" w:sz="0"/>
@@ -1183,14 +1185,9 @@
             </w:r>
           </w:p>
         </w:tc>
-      </w:tr>
-      <w:tr>
-        <w:trPr>
-          <w:cantSplit/>
-        </w:trPr>
-        <w:tc>
-          <w:tcPr>
-            <w:tcW w:type="pct" w:w="28%"/>
+        <w:tc>
+          <w:tcPr>
+            <w:tcW w:type="pct" w:w="14%"/>
             <w:tcBorders>
               <w:top w:val="none" w:color="FFFFFF" w:sz="0"/>
               <w:left w:val="none" w:color="FFFFFF" w:sz="0"/>
@@ -1216,7 +1213,7 @@
         </w:tc>
         <w:tc>
           <w:tcPr>
-            <w:tcW w:type="pct" w:w="72%"/>
+            <w:tcW w:type="pct" w:w="36%"/>
             <w:tcBorders>
               <w:top w:val="none" w:color="FFFFFF" w:sz="0"/>
               <w:left w:val="none" w:color="FFFFFF" w:sz="0"/>
@@ -1386,6 +1383,303 @@
           <w:szCs w:val="21"/>
         </w:rPr>
         <w:t xml:space="preserve">Mindre tekst- og billedopdateringer efter aftale</w:t>
+      </w:r>
+    </w:p>
+    <w:p>
+      <w:pPr>
+        <w:keepNext/>
+        <w:spacing w:after="40" w:before="100"/>
+      </w:pPr>
+    </w:p>
+    <w:tbl>
+      <w:tblPr>
+        <w:tblW w:type="pct" w:w="100%"/>
+        <w:tblBorders>
+          <w:top w:val="single" w:color="auto" w:sz="4"/>
+          <w:left w:val="single" w:color="auto" w:sz="4"/>
+          <w:bottom w:val="single" w:color="auto" w:sz="4"/>
+          <w:right w:val="single" w:color="auto" w:sz="4"/>
+          <w:insideH w:val="single" w:color="auto" w:sz="4"/>
+          <w:insideV w:val="single" w:color="auto" w:sz="4"/>
+        </w:tblBorders>
+      </w:tblPr>
+      <w:tblGrid>
+        <w:gridCol w:w="1300"/>
+        <w:gridCol w:w="3350"/>
+        <w:gridCol w:w="1300"/>
+        <w:gridCol w:w="3350"/>
+      </w:tblGrid>
+      <w:tr>
+        <w:trPr>
+          <w:cantSplit/>
+        </w:trPr>
+        <w:tc>
+          <w:tcPr>
+            <w:tcW w:type="pct" w:w="14%"/>
+            <w:tcBorders>
+              <w:top w:val="none" w:color="FFFFFF" w:sz="0"/>
+              <w:left w:val="none" w:color="FFFFFF" w:sz="0"/>
+              <w:bottom w:val="single" w:color="CCCCCC" w:sz="4"/>
+              <w:right w:val="none" w:color="FFFFFF" w:sz="0"/>
+            </w:tcBorders>
+            <w:vAlign w:val="center"/>
+          </w:tcPr>
+          <w:p>
+            <w:pPr>
+              <w:spacing w:after="0"/>
+            </w:pPr>
+            <w:r>
+              <w:rPr>
+                <w:b/>
+                <w:bCs/>
+                <w:sz w:val="21"/>
+                <w:szCs w:val="21"/>
+              </w:rPr>
+              <w:t xml:space="preserve">Etableringspris (engangs):</w:t>
+            </w:r>
+          </w:p>
+        </w:tc>
+        <w:tc>
+          <w:tcPr>
+            <w:tcW w:type="pct" w:w="36%"/>
+            <w:tcBorders>
+              <w:top w:val="none" w:color="FFFFFF" w:sz="0"/>
+              <w:left w:val="none" w:color="FFFFFF" w:sz="0"/>
+              <w:bottom w:val="single" w:color="CCCCCC" w:sz="4"/>
+              <w:right w:val="none" w:color="FFFFFF" w:sz="0"/>
+            </w:tcBorders>
+            <w:shd w:fill="EAF1FB" w:val="clear"/>
+            <w:tcMar>
+              <w:top w:type="dxa" w:w="60"/>
+              <w:left w:type="dxa" w:w="100"/>
+              <w:bottom w:type="dxa" w:w="60"/>
+              <w:right w:type="dxa" w:w="100"/>
+            </w:tcMar>
+            <w:vAlign w:val="center"/>
+          </w:tcPr>
+          <w:p>
+            <w:pPr>
+              <w:spacing w:after="0"/>
+            </w:pPr>
+            <w:r>
+              <w:rPr>
+                <w:rFonts w:ascii="Consolas" w:cs="Consolas" w:eastAsia="Consolas" w:hAnsi="Consolas"/>
+                <w:color w:val="000000"/>
+                <w:sz w:val="21"/>
+                <w:szCs w:val="21"/>
+              </w:rPr>
+              <w:t xml:space="preserve">[[Deal.Hjemmeside.SetupFee]]</w:t>
+            </w:r>
+            <w:r>
+              <w:rPr>
+                <w:i/>
+                <w:iCs/>
+                <w:color w:val="666666"/>
+                <w:sz w:val="17"/>
+                <w:szCs w:val="17"/>
+              </w:rPr>
+              <w:t xml:space="preserve">  (ekskl. moms)</w:t>
+            </w:r>
+          </w:p>
+        </w:tc>
+        <w:tc>
+          <w:tcPr>
+            <w:tcW w:type="pct" w:w="14%"/>
+            <w:tcBorders>
+              <w:top w:val="none" w:color="FFFFFF" w:sz="0"/>
+              <w:left w:val="none" w:color="FFFFFF" w:sz="0"/>
+              <w:bottom w:val="single" w:color="CCCCCC" w:sz="4"/>
+              <w:right w:val="none" w:color="FFFFFF" w:sz="0"/>
+            </w:tcBorders>
+            <w:vAlign w:val="center"/>
+          </w:tcPr>
+          <w:p>
+            <w:pPr>
+              <w:spacing w:after="0"/>
+            </w:pPr>
+            <w:r>
+              <w:rPr>
+                <w:b/>
+                <w:bCs/>
+                <w:sz w:val="21"/>
+                <w:szCs w:val="21"/>
+              </w:rPr>
+              <w:t xml:space="preserve">Pris pr. måned:</w:t>
+            </w:r>
+          </w:p>
+        </w:tc>
+        <w:tc>
+          <w:tcPr>
+            <w:tcW w:type="pct" w:w="36%"/>
+            <w:tcBorders>
+              <w:top w:val="none" w:color="FFFFFF" w:sz="0"/>
+              <w:left w:val="none" w:color="FFFFFF" w:sz="0"/>
+              <w:bottom w:val="single" w:color="CCCCCC" w:sz="4"/>
+              <w:right w:val="none" w:color="FFFFFF" w:sz="0"/>
+            </w:tcBorders>
+            <w:shd w:fill="EAF1FB" w:val="clear"/>
+            <w:tcMar>
+              <w:top w:type="dxa" w:w="60"/>
+              <w:left w:type="dxa" w:w="100"/>
+              <w:bottom w:type="dxa" w:w="60"/>
+              <w:right w:type="dxa" w:w="100"/>
+            </w:tcMar>
+            <w:vAlign w:val="center"/>
+          </w:tcPr>
+          <w:p>
+            <w:pPr>
+              <w:spacing w:after="0"/>
+            </w:pPr>
+            <w:r>
+              <w:rPr>
+                <w:rFonts w:ascii="Consolas" w:cs="Consolas" w:eastAsia="Consolas" w:hAnsi="Consolas"/>
+                <w:color w:val="000000"/>
+                <w:sz w:val="21"/>
+                <w:szCs w:val="21"/>
+              </w:rPr>
+              <w:t xml:space="preserve">[[Deal.Hjemmeside.Price]]</w:t>
+            </w:r>
+            <w:r>
+              <w:rPr>
+                <w:i/>
+                <w:iCs/>
+                <w:color w:val="666666"/>
+                <w:sz w:val="17"/>
+                <w:szCs w:val="17"/>
+              </w:rPr>
+              <w:t xml:space="preserve">  (ekskl. moms)</w:t>
+            </w:r>
+          </w:p>
+        </w:tc>
+      </w:tr>
+    </w:tbl>
+    <w:p>
+      <w:pPr>
+        <w:spacing w:after="60" w:before="80"/>
+      </w:pPr>
+      <w:r>
+        <w:rPr>
+          <w:rFonts w:ascii="Consolas" w:cs="Consolas" w:eastAsia="Consolas" w:hAnsi="Consolas"/>
+          <w:b/>
+          <w:bCs/>
+          <w:color w:val="B00020"/>
+          <w:sz w:val="15"/>
+          <w:szCs w:val="15"/>
+        </w:rPr>
+        <w:t xml:space="preserve">[[/Deal.Hjemmeside.Selected]]</w:t>
+      </w:r>
+    </w:p>
+    <w:p>
+      <w:pPr>
+        <w:keepNext/>
+        <w:pBdr>
+          <w:top w:val="single" w:color="1F3864" w:sz="2" w:space="6"/>
+        </w:pBdr>
+        <w:spacing w:after="40" w:before="260"/>
+      </w:pPr>
+      <w:r>
+        <w:rPr>
+          <w:rFonts w:ascii="Consolas" w:cs="Consolas" w:eastAsia="Consolas" w:hAnsi="Consolas"/>
+          <w:b/>
+          <w:bCs/>
+          <w:color w:val="B00020"/>
+          <w:sz w:val="15"/>
+          <w:szCs w:val="15"/>
+        </w:rPr>
+        <w:t xml:space="preserve">[[#Deal.DroneOptagelse.Selected]]</w:t>
+      </w:r>
+    </w:p>
+    <w:p>
+      <w:pPr>
+        <w:keepNext/>
+        <w:keepLines/>
+        <w:spacing w:after="80"/>
+      </w:pPr>
+      <w:r>
+        <w:rPr>
+          <w:b/>
+          <w:bCs/>
+          <w:color w:val="1F3864"/>
+          <w:sz w:val="23"/>
+          <w:szCs w:val="23"/>
+        </w:rPr>
+        <w:t xml:space="preserve">Drone-optagelse</w:t>
+      </w:r>
+    </w:p>
+    <w:p>
+      <w:pPr>
+        <w:pStyle w:val="ListParagraph"/>
+        <w:keepNext/>
+        <w:keepLines/>
+        <w:numPr>
+          <w:ilvl w:val="0"/>
+          <w:numId w:val="1"/>
+        </w:numPr>
+        <w:spacing w:after="60"/>
+      </w:pPr>
+      <w:r>
+        <w:rPr>
+          <w:sz w:val="21"/>
+          <w:szCs w:val="21"/>
+        </w:rPr>
+        <w:t xml:space="preserve">Luftfoto- og videooptagelse af lokation(er) med drone</w:t>
+      </w:r>
+    </w:p>
+    <w:p>
+      <w:pPr>
+        <w:pStyle w:val="ListParagraph"/>
+        <w:keepNext/>
+        <w:keepLines/>
+        <w:numPr>
+          <w:ilvl w:val="0"/>
+          <w:numId w:val="1"/>
+        </w:numPr>
+        <w:spacing w:after="60"/>
+      </w:pPr>
+      <w:r>
+        <w:rPr>
+          <w:sz w:val="21"/>
+          <w:szCs w:val="21"/>
+        </w:rPr>
+        <w:t xml:space="preserve">Efterbehandling og redigering af optaget materiale</w:t>
+      </w:r>
+    </w:p>
+    <w:p>
+      <w:pPr>
+        <w:pStyle w:val="ListParagraph"/>
+        <w:keepNext/>
+        <w:keepLines/>
+        <w:numPr>
+          <w:ilvl w:val="0"/>
+          <w:numId w:val="1"/>
+        </w:numPr>
+        <w:spacing w:after="60"/>
+      </w:pPr>
+      <w:r>
+        <w:rPr>
+          <w:sz w:val="21"/>
+          <w:szCs w:val="21"/>
+        </w:rPr>
+        <w:t xml:space="preserve">Levering af billeder/video i høj kvalitet til fri afbenyttelse</w:t>
+      </w:r>
+    </w:p>
+    <w:p>
+      <w:pPr>
+        <w:pStyle w:val="ListParagraph"/>
+        <w:keepNext/>
+        <w:keepLines/>
+        <w:numPr>
+          <w:ilvl w:val="0"/>
+          <w:numId w:val="1"/>
+        </w:numPr>
+        <w:spacing w:after="60"/>
+      </w:pPr>
+      <w:r>
+        <w:rPr>
+          <w:sz w:val="21"/>
+          <w:szCs w:val="21"/>
+        </w:rPr>
+        <w:t xml:space="preserve">Gennemføres efter forudgående aftale om dato og adgang</w:t>
       </w:r>
     </w:p>
     <w:p>
@@ -1469,81 +1763,7 @@
                 <w:sz w:val="21"/>
                 <w:szCs w:val="21"/>
               </w:rPr>
-              <w:t xml:space="preserve">[[Deal.Hjemmeside.SetupFee]]</w:t>
-            </w:r>
-            <w:r>
-              <w:rPr>
-                <w:i/>
-                <w:iCs/>
-                <w:color w:val="666666"/>
-                <w:sz w:val="17"/>
-                <w:szCs w:val="17"/>
-              </w:rPr>
-              <w:t xml:space="preserve">  (ekskl. moms)</w:t>
-            </w:r>
-          </w:p>
-        </w:tc>
-      </w:tr>
-      <w:tr>
-        <w:trPr>
-          <w:cantSplit/>
-        </w:trPr>
-        <w:tc>
-          <w:tcPr>
-            <w:tcW w:type="pct" w:w="28%"/>
-            <w:tcBorders>
-              <w:top w:val="none" w:color="FFFFFF" w:sz="0"/>
-              <w:left w:val="none" w:color="FFFFFF" w:sz="0"/>
-              <w:bottom w:val="single" w:color="CCCCCC" w:sz="4"/>
-              <w:right w:val="none" w:color="FFFFFF" w:sz="0"/>
-            </w:tcBorders>
-            <w:vAlign w:val="center"/>
-          </w:tcPr>
-          <w:p>
-            <w:pPr>
-              <w:spacing w:after="0"/>
-            </w:pPr>
-            <w:r>
-              <w:rPr>
-                <w:b/>
-                <w:bCs/>
-                <w:sz w:val="21"/>
-                <w:szCs w:val="21"/>
-              </w:rPr>
-              <w:t xml:space="preserve">Pris pr. måned:</w:t>
-            </w:r>
-          </w:p>
-        </w:tc>
-        <w:tc>
-          <w:tcPr>
-            <w:tcW w:type="pct" w:w="72%"/>
-            <w:tcBorders>
-              <w:top w:val="none" w:color="FFFFFF" w:sz="0"/>
-              <w:left w:val="none" w:color="FFFFFF" w:sz="0"/>
-              <w:bottom w:val="single" w:color="CCCCCC" w:sz="4"/>
-              <w:right w:val="none" w:color="FFFFFF" w:sz="0"/>
-            </w:tcBorders>
-            <w:shd w:fill="EAF1FB" w:val="clear"/>
-            <w:tcMar>
-              <w:top w:type="dxa" w:w="60"/>
-              <w:left w:type="dxa" w:w="100"/>
-              <w:bottom w:type="dxa" w:w="60"/>
-              <w:right w:type="dxa" w:w="100"/>
-            </w:tcMar>
-            <w:vAlign w:val="center"/>
-          </w:tcPr>
-          <w:p>
-            <w:pPr>
-              <w:spacing w:after="0"/>
-            </w:pPr>
-            <w:r>
-              <w:rPr>
-                <w:rFonts w:ascii="Consolas" w:cs="Consolas" w:eastAsia="Consolas" w:hAnsi="Consolas"/>
-                <w:color w:val="000000"/>
-                <w:sz w:val="21"/>
-                <w:szCs w:val="21"/>
-              </w:rPr>
-              <w:t xml:space="preserve">[[Deal.Hjemmeside.Price]]</w:t>
+              <w:t xml:space="preserve">[[Deal.DroneOptagelse.SetupFee]]</w:t>
             </w:r>
             <w:r>
               <w:rPr>
@@ -1572,7 +1792,7 @@
           <w:sz w:val="15"/>
           <w:szCs w:val="15"/>
         </w:rPr>
-        <w:t xml:space="preserve">[[/Deal.Hjemmeside.Selected]]</w:t>
+        <w:t xml:space="preserve">[[/Deal.DroneOptagelse.Selected]]</w:t>
       </w:r>
     </w:p>
     <w:p>
@@ -1592,7 +1812,7 @@
           <w:sz w:val="15"/>
           <w:szCs w:val="15"/>
         </w:rPr>
-        <w:t xml:space="preserve">[[#Deal.DroneOptagelse.Selected]]</w:t>
+        <w:t xml:space="preserve">[[#Deal.Visitkort.Selected]]</w:t>
       </w:r>
     </w:p>
     <w:p>
@@ -1609,7 +1829,7 @@
           <w:sz w:val="23"/>
           <w:szCs w:val="23"/>
         </w:rPr>
-        <w:t xml:space="preserve">Drone-optagelse</w:t>
+        <w:t xml:space="preserve">Visitkort med QR-kode til virtuel rundvisning</w:t>
       </w:r>
     </w:p>
     <w:p>
@@ -1628,7 +1848,7 @@
           <w:sz w:val="21"/>
           <w:szCs w:val="21"/>
         </w:rPr>
-        <w:t xml:space="preserve">Luftfoto- og videooptagelse af lokation(er) med drone</w:t>
+        <w:t xml:space="preserve">Fysiske visitkort med tilhørende unik QR-kode</w:t>
       </w:r>
     </w:p>
     <w:p>
@@ -1647,7 +1867,7 @@
           <w:sz w:val="21"/>
           <w:szCs w:val="21"/>
         </w:rPr>
-        <w:t xml:space="preserve">Efterbehandling og redigering af optaget materiale</w:t>
+        <w:t xml:space="preserve">QR-koden linker direkte til kundens virtuelle rundvisning</w:t>
       </w:r>
     </w:p>
     <w:p>
@@ -1666,26 +1886,7 @@
           <w:sz w:val="21"/>
           <w:szCs w:val="21"/>
         </w:rPr>
-        <w:t xml:space="preserve">Levering af billeder/video i høj kvalitet til fri afbenyttelse</w:t>
-      </w:r>
-    </w:p>
-    <w:p>
-      <w:pPr>
-        <w:pStyle w:val="ListParagraph"/>
-        <w:keepNext/>
-        <w:keepLines/>
-        <w:numPr>
-          <w:ilvl w:val="0"/>
-          <w:numId w:val="1"/>
-        </w:numPr>
-        <w:spacing w:after="60"/>
-      </w:pPr>
-      <w:r>
-        <w:rPr>
-          <w:sz w:val="21"/>
-          <w:szCs w:val="21"/>
-        </w:rPr>
-        <w:t xml:space="preserve">Gennemføres efter forudgående aftale om dato og adgang</w:t>
+        <w:t xml:space="preserve">Design tilpasses kundens eksisterende visuelle identitet</w:t>
       </w:r>
     </w:p>
     <w:p>
@@ -1707,8 +1908,10 @@
         </w:tblBorders>
       </w:tblPr>
       <w:tblGrid>
-        <w:gridCol w:w="2600"/>
-        <w:gridCol w:w="6700"/>
+        <w:gridCol w:w="1300"/>
+        <w:gridCol w:w="3350"/>
+        <w:gridCol w:w="1300"/>
+        <w:gridCol w:w="3350"/>
       </w:tblGrid>
       <w:tr>
         <w:trPr>
@@ -1716,7 +1919,7 @@
         </w:trPr>
         <w:tc>
           <w:tcPr>
-            <w:tcW w:type="pct" w:w="28%"/>
+            <w:tcW w:type="pct" w:w="14%"/>
             <w:tcBorders>
               <w:top w:val="none" w:color="FFFFFF" w:sz="0"/>
               <w:left w:val="none" w:color="FFFFFF" w:sz="0"/>
@@ -1736,13 +1939,13 @@
                 <w:sz w:val="21"/>
                 <w:szCs w:val="21"/>
               </w:rPr>
-              <w:t xml:space="preserve">Etableringspris (engangs):</w:t>
-            </w:r>
-          </w:p>
-        </w:tc>
-        <w:tc>
-          <w:tcPr>
-            <w:tcW w:type="pct" w:w="72%"/>
+              <w:t xml:space="preserve">Antal:</w:t>
+            </w:r>
+          </w:p>
+        </w:tc>
+        <w:tc>
+          <w:tcPr>
+            <w:tcW w:type="pct" w:w="36%"/>
             <w:tcBorders>
               <w:top w:val="none" w:color="FFFFFF" w:sz="0"/>
               <w:left w:val="none" w:color="FFFFFF" w:sz="0"/>
@@ -1769,7 +1972,7 @@
                 <w:sz w:val="21"/>
                 <w:szCs w:val="21"/>
               </w:rPr>
-              <w:t xml:space="preserve">[[Deal.DroneOptagelse.SetupFee]]</w:t>
+              <w:t xml:space="preserve">[[Deal.Visitkort.Quantity]]</w:t>
             </w:r>
             <w:r>
               <w:rPr>
@@ -1779,151 +1982,13 @@
                 <w:sz w:val="17"/>
                 <w:szCs w:val="17"/>
               </w:rPr>
-              <w:t xml:space="preserve">  (ekskl. moms)</w:t>
-            </w:r>
-          </w:p>
-        </w:tc>
-      </w:tr>
-    </w:tbl>
-    <w:p>
-      <w:pPr>
-        <w:spacing w:after="60" w:before="80"/>
-      </w:pPr>
-      <w:r>
-        <w:rPr>
-          <w:rFonts w:ascii="Consolas" w:cs="Consolas" w:eastAsia="Consolas" w:hAnsi="Consolas"/>
-          <w:b/>
-          <w:bCs/>
-          <w:color w:val="B00020"/>
-          <w:sz w:val="15"/>
-          <w:szCs w:val="15"/>
-        </w:rPr>
-        <w:t xml:space="preserve">[[/Deal.DroneOptagelse.Selected]]</w:t>
-      </w:r>
-    </w:p>
-    <w:p>
-      <w:pPr>
-        <w:keepNext/>
-        <w:pBdr>
-          <w:top w:val="single" w:color="1F3864" w:sz="2" w:space="6"/>
-        </w:pBdr>
-        <w:spacing w:after="40" w:before="260"/>
-      </w:pPr>
-      <w:r>
-        <w:rPr>
-          <w:rFonts w:ascii="Consolas" w:cs="Consolas" w:eastAsia="Consolas" w:hAnsi="Consolas"/>
-          <w:b/>
-          <w:bCs/>
-          <w:color w:val="B00020"/>
-          <w:sz w:val="15"/>
-          <w:szCs w:val="15"/>
-        </w:rPr>
-        <w:t xml:space="preserve">[[#Deal.Visitkort.Selected]]</w:t>
-      </w:r>
-    </w:p>
-    <w:p>
-      <w:pPr>
-        <w:keepNext/>
-        <w:keepLines/>
-        <w:spacing w:after="80"/>
-      </w:pPr>
-      <w:r>
-        <w:rPr>
-          <w:b/>
-          <w:bCs/>
-          <w:color w:val="1F3864"/>
-          <w:sz w:val="23"/>
-          <w:szCs w:val="23"/>
-        </w:rPr>
-        <w:t xml:space="preserve">Visitkort med QR-kode til virtuel rundvisning</w:t>
-      </w:r>
-    </w:p>
-    <w:p>
-      <w:pPr>
-        <w:pStyle w:val="ListParagraph"/>
-        <w:keepNext/>
-        <w:keepLines/>
-        <w:numPr>
-          <w:ilvl w:val="0"/>
-          <w:numId w:val="1"/>
-        </w:numPr>
-        <w:spacing w:after="60"/>
-      </w:pPr>
-      <w:r>
-        <w:rPr>
-          <w:sz w:val="21"/>
-          <w:szCs w:val="21"/>
-        </w:rPr>
-        <w:t xml:space="preserve">Fysiske visitkort med tilhørende unik QR-kode</w:t>
-      </w:r>
-    </w:p>
-    <w:p>
-      <w:pPr>
-        <w:pStyle w:val="ListParagraph"/>
-        <w:keepNext/>
-        <w:keepLines/>
-        <w:numPr>
-          <w:ilvl w:val="0"/>
-          <w:numId w:val="1"/>
-        </w:numPr>
-        <w:spacing w:after="60"/>
-      </w:pPr>
-      <w:r>
-        <w:rPr>
-          <w:sz w:val="21"/>
-          <w:szCs w:val="21"/>
-        </w:rPr>
-        <w:t xml:space="preserve">QR-koden linker direkte til kundens virtuelle rundvisning</w:t>
-      </w:r>
-    </w:p>
-    <w:p>
-      <w:pPr>
-        <w:pStyle w:val="ListParagraph"/>
-        <w:keepNext/>
-        <w:keepLines/>
-        <w:numPr>
-          <w:ilvl w:val="0"/>
-          <w:numId w:val="1"/>
-        </w:numPr>
-        <w:spacing w:after="60"/>
-      </w:pPr>
-      <w:r>
-        <w:rPr>
-          <w:sz w:val="21"/>
-          <w:szCs w:val="21"/>
-        </w:rPr>
-        <w:t xml:space="preserve">Design tilpasses kundens eksisterende visuelle identitet</w:t>
-      </w:r>
-    </w:p>
-    <w:p>
-      <w:pPr>
-        <w:keepNext/>
-        <w:spacing w:after="40" w:before="100"/>
-      </w:pPr>
-    </w:p>
-    <w:tbl>
-      <w:tblPr>
-        <w:tblW w:type="pct" w:w="100%"/>
-        <w:tblBorders>
-          <w:top w:val="single" w:color="auto" w:sz="4"/>
-          <w:left w:val="single" w:color="auto" w:sz="4"/>
-          <w:bottom w:val="single" w:color="auto" w:sz="4"/>
-          <w:right w:val="single" w:color="auto" w:sz="4"/>
-          <w:insideH w:val="single" w:color="auto" w:sz="4"/>
-          <w:insideV w:val="single" w:color="auto" w:sz="4"/>
-        </w:tblBorders>
-      </w:tblPr>
-      <w:tblGrid>
-        <w:gridCol w:w="2600"/>
-        <w:gridCol w:w="6700"/>
-      </w:tblGrid>
-      <w:tr>
-        <w:trPr>
-          <w:cantSplit/>
-        </w:trPr>
-        <w:tc>
-          <w:tcPr>
-            <w:tcW w:type="pct" w:w="28%"/>
+              <w:t xml:space="preserve"/>
+            </w:r>
+          </w:p>
+        </w:tc>
+        <w:tc>
+          <w:tcPr>
+            <w:tcW w:type="pct" w:w="14%"/>
             <w:tcBorders>
               <w:top w:val="none" w:color="FFFFFF" w:sz="0"/>
               <w:left w:val="none" w:color="FFFFFF" w:sz="0"/>
@@ -1943,87 +2008,13 @@
                 <w:sz w:val="21"/>
                 <w:szCs w:val="21"/>
               </w:rPr>
-              <w:t xml:space="preserve">Antal:</w:t>
-            </w:r>
-          </w:p>
-        </w:tc>
-        <w:tc>
-          <w:tcPr>
-            <w:tcW w:type="pct" w:w="72%"/>
-            <w:tcBorders>
-              <w:top w:val="none" w:color="FFFFFF" w:sz="0"/>
-              <w:left w:val="none" w:color="FFFFFF" w:sz="0"/>
-              <w:bottom w:val="single" w:color="CCCCCC" w:sz="4"/>
-              <w:right w:val="none" w:color="FFFFFF" w:sz="0"/>
-            </w:tcBorders>
-            <w:shd w:fill="EAF1FB" w:val="clear"/>
-            <w:tcMar>
-              <w:top w:type="dxa" w:w="60"/>
-              <w:left w:type="dxa" w:w="100"/>
-              <w:bottom w:type="dxa" w:w="60"/>
-              <w:right w:type="dxa" w:w="100"/>
-            </w:tcMar>
-            <w:vAlign w:val="center"/>
-          </w:tcPr>
-          <w:p>
-            <w:pPr>
-              <w:spacing w:after="0"/>
-            </w:pPr>
-            <w:r>
-              <w:rPr>
-                <w:rFonts w:ascii="Consolas" w:cs="Consolas" w:eastAsia="Consolas" w:hAnsi="Consolas"/>
-                <w:color w:val="000000"/>
-                <w:sz w:val="21"/>
-                <w:szCs w:val="21"/>
-              </w:rPr>
-              <w:t xml:space="preserve">[[Deal.Visitkort.Quantity]]</w:t>
-            </w:r>
-            <w:r>
-              <w:rPr>
-                <w:i/>
-                <w:iCs/>
-                <w:color w:val="666666"/>
-                <w:sz w:val="17"/>
-                <w:szCs w:val="17"/>
-              </w:rPr>
-              <w:t xml:space="preserve"/>
-            </w:r>
-          </w:p>
-        </w:tc>
-      </w:tr>
-      <w:tr>
-        <w:trPr>
-          <w:cantSplit/>
-        </w:trPr>
-        <w:tc>
-          <w:tcPr>
-            <w:tcW w:type="pct" w:w="28%"/>
-            <w:tcBorders>
-              <w:top w:val="none" w:color="FFFFFF" w:sz="0"/>
-              <w:left w:val="none" w:color="FFFFFF" w:sz="0"/>
-              <w:bottom w:val="single" w:color="CCCCCC" w:sz="4"/>
-              <w:right w:val="none" w:color="FFFFFF" w:sz="0"/>
-            </w:tcBorders>
-            <w:vAlign w:val="center"/>
-          </w:tcPr>
-          <w:p>
-            <w:pPr>
-              <w:spacing w:after="0"/>
-            </w:pPr>
-            <w:r>
-              <w:rPr>
-                <w:b/>
-                <w:bCs/>
-                <w:sz w:val="21"/>
-                <w:szCs w:val="21"/>
-              </w:rPr>
               <w:t xml:space="preserve">Etableringspris (engangs):</w:t>
             </w:r>
           </w:p>
         </w:tc>
         <w:tc>
           <w:tcPr>
-            <w:tcW w:type="pct" w:w="72%"/>
+            <w:tcW w:type="pct" w:w="36%"/>
             <w:tcBorders>
               <w:top w:val="none" w:color="FFFFFF" w:sz="0"/>
               <w:left w:val="none" w:color="FFFFFF" w:sz="0"/>

</xml_diff>